<commit_message>
add doi to zaid's paper
</commit_message>
<xml_diff>
--- a/cv.docx
+++ b/cv.docx
@@ -60,7 +60,6 @@
           <w:rPr>
             <w:rStyle w:val="Hyperlink"/>
             <w:rFonts w:ascii="Helvetica" w:hAnsi="Helvetica" w:cs="Times New Roman"/>
-            <w:color w:val="0070C0"/>
             <w:sz w:val="18"/>
             <w:szCs w:val="18"/>
           </w:rPr>
@@ -128,7 +127,6 @@
           <w:rPr>
             <w:rStyle w:val="Hyperlink"/>
             <w:rFonts w:ascii="Helvetica" w:hAnsi="Helvetica" w:cs="Times New Roman"/>
-            <w:color w:val="0070C0"/>
             <w:sz w:val="18"/>
             <w:szCs w:val="18"/>
           </w:rPr>
@@ -182,7 +180,6 @@
           <w:rPr>
             <w:rStyle w:val="Hyperlink"/>
             <w:rFonts w:ascii="Helvetica" w:hAnsi="Helvetica" w:cs="Times New Roman"/>
-            <w:color w:val="0070C0"/>
             <w:sz w:val="18"/>
             <w:szCs w:val="18"/>
           </w:rPr>
@@ -192,7 +189,6 @@
           <w:rPr>
             <w:rStyle w:val="Hyperlink"/>
             <w:rFonts w:ascii="Helvetica" w:hAnsi="Helvetica" w:cs="Times New Roman"/>
-            <w:color w:val="0070C0"/>
             <w:sz w:val="18"/>
             <w:szCs w:val="18"/>
           </w:rPr>
@@ -202,7 +198,6 @@
           <w:rPr>
             <w:rStyle w:val="Hyperlink"/>
             <w:rFonts w:ascii="Helvetica" w:hAnsi="Helvetica" w:cs="Times New Roman"/>
-            <w:color w:val="0070C0"/>
             <w:sz w:val="18"/>
             <w:szCs w:val="18"/>
           </w:rPr>
@@ -264,7 +259,6 @@
           <w:rPr>
             <w:rStyle w:val="Hyperlink"/>
             <w:rFonts w:ascii="Helvetica" w:hAnsi="Helvetica" w:cs="Times New Roman"/>
-            <w:color w:val="0070C0"/>
             <w:sz w:val="18"/>
             <w:szCs w:val="18"/>
           </w:rPr>
@@ -610,7 +604,25 @@
           <w:sz w:val="18"/>
           <w:szCs w:val="18"/>
         </w:rPr>
-        <w:t>Advisor: Dr. Kangsoo Kim</w:t>
+        <w:t xml:space="preserve">Advisor: Dr. </w:t>
+      </w:r>
+      <w:proofErr w:type="spellStart"/>
+      <w:r>
+        <w:rPr>
+          <w:rFonts w:ascii="Helvetica" w:hAnsi="Helvetica" w:cs="Helvetica"/>
+          <w:sz w:val="18"/>
+          <w:szCs w:val="18"/>
+        </w:rPr>
+        <w:t>Kangsoo</w:t>
+      </w:r>
+      <w:proofErr w:type="spellEnd"/>
+      <w:r>
+        <w:rPr>
+          <w:rFonts w:ascii="Helvetica" w:hAnsi="Helvetica" w:cs="Helvetica"/>
+          <w:sz w:val="18"/>
+          <w:szCs w:val="18"/>
+        </w:rPr>
+        <w:t xml:space="preserve"> Kim</w:t>
       </w:r>
     </w:p>
     <w:p>
@@ -743,7 +755,87 @@
           <w:sz w:val="18"/>
           <w:szCs w:val="18"/>
         </w:rPr>
-        <w:t>, Junyeong Kum, Hyeongil Nam, Myungho Lee, Kangsoo Kim. “</w:t>
+        <w:t xml:space="preserve">, </w:t>
+      </w:r>
+      <w:proofErr w:type="spellStart"/>
+      <w:r>
+        <w:rPr>
+          <w:rFonts w:ascii="Helvetica" w:hAnsi="Helvetica" w:cs="Helvetica"/>
+          <w:color w:val="000000" w:themeColor="text1"/>
+          <w:sz w:val="18"/>
+          <w:szCs w:val="18"/>
+        </w:rPr>
+        <w:t>Junyeong</w:t>
+      </w:r>
+      <w:proofErr w:type="spellEnd"/>
+      <w:r>
+        <w:rPr>
+          <w:rFonts w:ascii="Helvetica" w:hAnsi="Helvetica" w:cs="Helvetica"/>
+          <w:color w:val="000000" w:themeColor="text1"/>
+          <w:sz w:val="18"/>
+          <w:szCs w:val="18"/>
+        </w:rPr>
+        <w:t xml:space="preserve"> Kum, </w:t>
+      </w:r>
+      <w:proofErr w:type="spellStart"/>
+      <w:r>
+        <w:rPr>
+          <w:rFonts w:ascii="Helvetica" w:hAnsi="Helvetica" w:cs="Helvetica"/>
+          <w:color w:val="000000" w:themeColor="text1"/>
+          <w:sz w:val="18"/>
+          <w:szCs w:val="18"/>
+        </w:rPr>
+        <w:t>Hyeongil</w:t>
+      </w:r>
+      <w:proofErr w:type="spellEnd"/>
+      <w:r>
+        <w:rPr>
+          <w:rFonts w:ascii="Helvetica" w:hAnsi="Helvetica" w:cs="Helvetica"/>
+          <w:color w:val="000000" w:themeColor="text1"/>
+          <w:sz w:val="18"/>
+          <w:szCs w:val="18"/>
+        </w:rPr>
+        <w:t xml:space="preserve"> Nam, </w:t>
+      </w:r>
+      <w:proofErr w:type="spellStart"/>
+      <w:r>
+        <w:rPr>
+          <w:rFonts w:ascii="Helvetica" w:hAnsi="Helvetica" w:cs="Helvetica"/>
+          <w:color w:val="000000" w:themeColor="text1"/>
+          <w:sz w:val="18"/>
+          <w:szCs w:val="18"/>
+        </w:rPr>
+        <w:t>Myungho</w:t>
+      </w:r>
+      <w:proofErr w:type="spellEnd"/>
+      <w:r>
+        <w:rPr>
+          <w:rFonts w:ascii="Helvetica" w:hAnsi="Helvetica" w:cs="Helvetica"/>
+          <w:color w:val="000000" w:themeColor="text1"/>
+          <w:sz w:val="18"/>
+          <w:szCs w:val="18"/>
+        </w:rPr>
+        <w:t xml:space="preserve"> Lee, </w:t>
+      </w:r>
+      <w:proofErr w:type="spellStart"/>
+      <w:r>
+        <w:rPr>
+          <w:rFonts w:ascii="Helvetica" w:hAnsi="Helvetica" w:cs="Helvetica"/>
+          <w:color w:val="000000" w:themeColor="text1"/>
+          <w:sz w:val="18"/>
+          <w:szCs w:val="18"/>
+        </w:rPr>
+        <w:t>Kangsoo</w:t>
+      </w:r>
+      <w:proofErr w:type="spellEnd"/>
+      <w:r>
+        <w:rPr>
+          <w:rFonts w:ascii="Helvetica" w:hAnsi="Helvetica" w:cs="Helvetica"/>
+          <w:color w:val="000000" w:themeColor="text1"/>
+          <w:sz w:val="18"/>
+          <w:szCs w:val="18"/>
+        </w:rPr>
+        <w:t xml:space="preserve"> Kim. “</w:t>
       </w:r>
       <w:r>
         <w:rPr>
@@ -779,16 +871,16 @@
           <w:sz w:val="18"/>
           <w:szCs w:val="18"/>
         </w:rPr>
-        <w:t>. To appear in IEEE Transactions on Visualization and Computer Graphics (TVCG)</w:t>
-      </w:r>
-      <w:r>
-        <w:rPr>
-          <w:rFonts w:ascii="Helvetica" w:hAnsi="Helvetica" w:cs="Helvetica"/>
-          <w:color w:val="000000" w:themeColor="text1"/>
-          <w:sz w:val="18"/>
-          <w:szCs w:val="18"/>
-        </w:rPr>
-        <w:t>.</w:t>
+        <w:t>. IEEE Transactions on Visualization and Computer Graphics (TVCG)</w:t>
+      </w:r>
+      <w:r>
+        <w:rPr>
+          <w:rFonts w:ascii="Helvetica" w:hAnsi="Helvetica" w:cs="Helvetica"/>
+          <w:color w:val="000000" w:themeColor="text1"/>
+          <w:sz w:val="18"/>
+          <w:szCs w:val="18"/>
+        </w:rPr>
+        <w:t>, vol. xx, no. xx, pp. xx-xx, 2026.</w:t>
       </w:r>
       <w:r>
         <w:rPr>
@@ -804,7 +896,6 @@
           <w:rPr>
             <w:rStyle w:val="Hyperlink"/>
             <w:rFonts w:ascii="Helvetica" w:hAnsi="Helvetica" w:cs="Helvetica"/>
-            <w:color w:val="0070C0"/>
             <w:sz w:val="18"/>
             <w:szCs w:val="18"/>
           </w:rPr>
@@ -819,7 +910,24 @@
           <w:szCs w:val="18"/>
         </w:rPr>
         <w:br/>
-        <w:t>JCR IF-2024: 6.5.</w:t>
+      </w:r>
+      <w:r>
+        <w:rPr>
+          <w:rFonts w:ascii="Helvetica" w:hAnsi="Helvetica" w:cs="Helvetica"/>
+          <w:color w:val="000000" w:themeColor="text1"/>
+          <w:sz w:val="18"/>
+          <w:szCs w:val="18"/>
+        </w:rPr>
+        <w:t>Acceptance rate: 20%, Impact Factor</w:t>
+      </w:r>
+      <w:r>
+        <w:rPr>
+          <w:rFonts w:ascii="Helvetica" w:hAnsi="Helvetica" w:cs="Helvetica"/>
+          <w:color w:val="000000" w:themeColor="text1"/>
+          <w:sz w:val="18"/>
+          <w:szCs w:val="18"/>
+        </w:rPr>
+        <w:t>: 6.5.</w:t>
       </w:r>
     </w:p>
     <w:p>
@@ -867,7 +975,47 @@
           <w:sz w:val="18"/>
           <w:szCs w:val="18"/>
         </w:rPr>
-        <w:t xml:space="preserve">, Hyeongil Nam, Kangsoo Kim. “Impact of Avatar-Locomotion Congruence on User Experience and Identification in Virtual Reality”. </w:t>
+        <w:t xml:space="preserve">, </w:t>
+      </w:r>
+      <w:proofErr w:type="spellStart"/>
+      <w:r>
+        <w:rPr>
+          <w:rFonts w:ascii="Helvetica" w:hAnsi="Helvetica" w:cs="Helvetica"/>
+          <w:color w:val="000000" w:themeColor="text1"/>
+          <w:sz w:val="18"/>
+          <w:szCs w:val="18"/>
+        </w:rPr>
+        <w:t>Hyeongil</w:t>
+      </w:r>
+      <w:proofErr w:type="spellEnd"/>
+      <w:r>
+        <w:rPr>
+          <w:rFonts w:ascii="Helvetica" w:hAnsi="Helvetica" w:cs="Helvetica"/>
+          <w:color w:val="000000" w:themeColor="text1"/>
+          <w:sz w:val="18"/>
+          <w:szCs w:val="18"/>
+        </w:rPr>
+        <w:t xml:space="preserve"> Nam, </w:t>
+      </w:r>
+      <w:proofErr w:type="spellStart"/>
+      <w:r>
+        <w:rPr>
+          <w:rFonts w:ascii="Helvetica" w:hAnsi="Helvetica" w:cs="Helvetica"/>
+          <w:color w:val="000000" w:themeColor="text1"/>
+          <w:sz w:val="18"/>
+          <w:szCs w:val="18"/>
+        </w:rPr>
+        <w:t>Kangsoo</w:t>
+      </w:r>
+      <w:proofErr w:type="spellEnd"/>
+      <w:r>
+        <w:rPr>
+          <w:rFonts w:ascii="Helvetica" w:hAnsi="Helvetica" w:cs="Helvetica"/>
+          <w:color w:val="000000" w:themeColor="text1"/>
+          <w:sz w:val="18"/>
+          <w:szCs w:val="18"/>
+        </w:rPr>
+        <w:t xml:space="preserve"> Kim. “Impact of Avatar-Locomotion Congruence on User Experience and Identification in Virtual Reality”. </w:t>
       </w:r>
       <w:r>
         <w:rPr>
@@ -892,7 +1040,6 @@
           <w:rPr>
             <w:rStyle w:val="Hyperlink"/>
             <w:rFonts w:ascii="Helvetica" w:hAnsi="Helvetica" w:cs="Helvetica"/>
-            <w:color w:val="0070C0"/>
             <w:sz w:val="18"/>
             <w:szCs w:val="18"/>
           </w:rPr>
@@ -915,7 +1062,25 @@
           <w:sz w:val="18"/>
           <w:szCs w:val="18"/>
         </w:rPr>
-        <w:t>Acceptance rate: 8%, JCR IF-2024: 6.5.</w:t>
+        <w:t xml:space="preserve">Acceptance rate: 8%, </w:t>
+      </w:r>
+      <w:r>
+        <w:rPr>
+          <w:rFonts w:ascii="Helvetica" w:hAnsi="Helvetica" w:cs="Helvetica"/>
+          <w:color w:val="000000" w:themeColor="text1"/>
+          <w:sz w:val="18"/>
+          <w:szCs w:val="18"/>
+        </w:rPr>
+        <w:t>Impact Factor</w:t>
+      </w:r>
+      <w:r>
+        <w:rPr>
+          <w:rFonts w:ascii="Helvetica" w:hAnsi="Helvetica" w:cs="Helvetica"/>
+          <w:color w:val="000000" w:themeColor="text1"/>
+          <w:sz w:val="18"/>
+          <w:szCs w:val="18"/>
+        </w:rPr>
+        <w:t>: 6.5.</w:t>
       </w:r>
       <w:r>
         <w:rPr>
@@ -1007,14 +1172,45 @@
         </w:rPr>
         <w:t xml:space="preserve">, </w:t>
       </w:r>
-      <w:r>
-        <w:rPr>
-          <w:rFonts w:ascii="Helvetica" w:hAnsi="Helvetica" w:cs="Helvetica"/>
-          <w:color w:val="000000" w:themeColor="text1"/>
-          <w:sz w:val="18"/>
-          <w:szCs w:val="18"/>
-        </w:rPr>
-        <w:t>Hyeongil Nam, Kangsoo Kim. “</w:t>
+      <w:proofErr w:type="spellStart"/>
+      <w:r>
+        <w:rPr>
+          <w:rFonts w:ascii="Helvetica" w:hAnsi="Helvetica" w:cs="Helvetica"/>
+          <w:color w:val="000000" w:themeColor="text1"/>
+          <w:sz w:val="18"/>
+          <w:szCs w:val="18"/>
+        </w:rPr>
+        <w:t>Hyeongil</w:t>
+      </w:r>
+      <w:proofErr w:type="spellEnd"/>
+      <w:r>
+        <w:rPr>
+          <w:rFonts w:ascii="Helvetica" w:hAnsi="Helvetica" w:cs="Helvetica"/>
+          <w:color w:val="000000" w:themeColor="text1"/>
+          <w:sz w:val="18"/>
+          <w:szCs w:val="18"/>
+        </w:rPr>
+        <w:t xml:space="preserve"> Nam, </w:t>
+      </w:r>
+      <w:proofErr w:type="spellStart"/>
+      <w:r>
+        <w:rPr>
+          <w:rFonts w:ascii="Helvetica" w:hAnsi="Helvetica" w:cs="Helvetica"/>
+          <w:color w:val="000000" w:themeColor="text1"/>
+          <w:sz w:val="18"/>
+          <w:szCs w:val="18"/>
+        </w:rPr>
+        <w:t>Kangsoo</w:t>
+      </w:r>
+      <w:proofErr w:type="spellEnd"/>
+      <w:r>
+        <w:rPr>
+          <w:rFonts w:ascii="Helvetica" w:hAnsi="Helvetica" w:cs="Helvetica"/>
+          <w:color w:val="000000" w:themeColor="text1"/>
+          <w:sz w:val="18"/>
+          <w:szCs w:val="18"/>
+        </w:rPr>
+        <w:t xml:space="preserve"> Kim. “</w:t>
       </w:r>
       <w:r>
         <w:rPr>
@@ -1043,7 +1239,63 @@
           <w:sz w:val="18"/>
           <w:szCs w:val="18"/>
         </w:rPr>
-        <w:t>To appear in ACM CHI Conference Extended Abstracts on Human Factors in Computing Systems (CHI EA), 2026</w:t>
+        <w:t xml:space="preserve">Proceedings of </w:t>
+      </w:r>
+      <w:r>
+        <w:rPr>
+          <w:rFonts w:ascii="Helvetica" w:hAnsi="Helvetica" w:cs="Helvetica"/>
+          <w:i/>
+          <w:iCs/>
+          <w:color w:val="000000" w:themeColor="text1"/>
+          <w:sz w:val="18"/>
+          <w:szCs w:val="18"/>
+        </w:rPr>
+        <w:t>ACM CHI Conference Extended Abstracts on Human Factors in Computing Systems (CHI EA)</w:t>
+      </w:r>
+      <w:r>
+        <w:rPr>
+          <w:rFonts w:ascii="Helvetica" w:hAnsi="Helvetica" w:cs="Helvetica"/>
+          <w:color w:val="000000" w:themeColor="text1"/>
+          <w:sz w:val="18"/>
+          <w:szCs w:val="18"/>
+        </w:rPr>
+        <w:t xml:space="preserve">, </w:t>
+      </w:r>
+      <w:r>
+        <w:rPr>
+          <w:rFonts w:ascii="Helvetica" w:hAnsi="Helvetica" w:cs="Helvetica"/>
+          <w:color w:val="000000" w:themeColor="text1"/>
+          <w:sz w:val="18"/>
+          <w:szCs w:val="18"/>
+        </w:rPr>
+        <w:t>no. 269, pp.</w:t>
+      </w:r>
+      <w:r>
+        <w:rPr>
+          <w:rFonts w:ascii="Helvetica" w:hAnsi="Helvetica" w:cs="Helvetica"/>
+          <w:color w:val="000000" w:themeColor="text1"/>
+          <w:sz w:val="18"/>
+          <w:szCs w:val="18"/>
+        </w:rPr>
+        <w:t xml:space="preserve"> 1-5,</w:t>
+      </w:r>
+      <w:r>
+        <w:rPr>
+          <w:rFonts w:ascii="Helvetica" w:hAnsi="Helvetica" w:cs="Helvetica"/>
+          <w:color w:val="000000" w:themeColor="text1"/>
+          <w:sz w:val="18"/>
+          <w:szCs w:val="18"/>
+        </w:rPr>
+        <w:t xml:space="preserve"> </w:t>
+      </w:r>
+      <w:r>
+        <w:rPr>
+          <w:rFonts w:ascii="Helvetica" w:hAnsi="Helvetica" w:cs="Helvetica"/>
+          <w:color w:val="000000" w:themeColor="text1"/>
+          <w:sz w:val="18"/>
+          <w:szCs w:val="18"/>
+        </w:rPr>
+        <w:t>2026</w:t>
       </w:r>
       <w:r>
         <w:rPr>
@@ -1054,6 +1306,26 @@
         </w:rPr>
         <w:t>.</w:t>
       </w:r>
+      <w:r>
+        <w:rPr>
+          <w:rFonts w:ascii="Helvetica" w:hAnsi="Helvetica" w:cs="Helvetica"/>
+          <w:color w:val="000000" w:themeColor="text1"/>
+          <w:sz w:val="18"/>
+          <w:szCs w:val="18"/>
+        </w:rPr>
+        <w:t xml:space="preserve"> </w:t>
+      </w:r>
+      <w:hyperlink r:id="rId14" w:history="1">
+        <w:r>
+          <w:rPr>
+            <w:rStyle w:val="Hyperlink"/>
+            <w:rFonts w:ascii="Helvetica" w:hAnsi="Helvetica" w:cs="Helvetica"/>
+            <w:sz w:val="18"/>
+            <w:szCs w:val="18"/>
+          </w:rPr>
+          <w:t>https://doi.org/10.1145/3772363.3798977</w:t>
+        </w:r>
+      </w:hyperlink>
       <w:r>
         <w:rPr>
           <w:rFonts w:ascii="Helvetica" w:hAnsi="Helvetica" w:cs="Helvetica"/>
@@ -1146,7 +1418,47 @@
           <w:sz w:val="18"/>
           <w:szCs w:val="18"/>
         </w:rPr>
-        <w:t xml:space="preserve">Zaid Ahmed, Hyeongil Nam, Kangsoo Kim. “TangibleMoments: Embedding XR Memories onto Physical Objects”. </w:t>
+        <w:t xml:space="preserve">Zaid Ahmed, </w:t>
+      </w:r>
+      <w:proofErr w:type="spellStart"/>
+      <w:r>
+        <w:rPr>
+          <w:rFonts w:ascii="Helvetica" w:hAnsi="Helvetica" w:cs="Helvetica"/>
+          <w:color w:val="000000" w:themeColor="text1"/>
+          <w:sz w:val="18"/>
+          <w:szCs w:val="18"/>
+        </w:rPr>
+        <w:t>Hyeongil</w:t>
+      </w:r>
+      <w:proofErr w:type="spellEnd"/>
+      <w:r>
+        <w:rPr>
+          <w:rFonts w:ascii="Helvetica" w:hAnsi="Helvetica" w:cs="Helvetica"/>
+          <w:color w:val="000000" w:themeColor="text1"/>
+          <w:sz w:val="18"/>
+          <w:szCs w:val="18"/>
+        </w:rPr>
+        <w:t xml:space="preserve"> Nam, </w:t>
+      </w:r>
+      <w:proofErr w:type="spellStart"/>
+      <w:r>
+        <w:rPr>
+          <w:rFonts w:ascii="Helvetica" w:hAnsi="Helvetica" w:cs="Helvetica"/>
+          <w:color w:val="000000" w:themeColor="text1"/>
+          <w:sz w:val="18"/>
+          <w:szCs w:val="18"/>
+        </w:rPr>
+        <w:t>Kangsoo</w:t>
+      </w:r>
+      <w:proofErr w:type="spellEnd"/>
+      <w:r>
+        <w:rPr>
+          <w:rFonts w:ascii="Helvetica" w:hAnsi="Helvetica" w:cs="Helvetica"/>
+          <w:color w:val="000000" w:themeColor="text1"/>
+          <w:sz w:val="18"/>
+          <w:szCs w:val="18"/>
+        </w:rPr>
+        <w:t xml:space="preserve"> Kim. “TangibleMoments: Embedding XR Memories onto Physical Objects”. </w:t>
       </w:r>
       <w:r>
         <w:rPr>
@@ -1177,6 +1489,15 @@
           <w:sz w:val="18"/>
           <w:szCs w:val="18"/>
         </w:rPr>
+        <w:t>, pp. 1142-1146</w:t>
+      </w:r>
+      <w:r>
+        <w:rPr>
+          <w:rFonts w:ascii="Helvetica" w:hAnsi="Helvetica" w:cs="Helvetica"/>
+          <w:color w:val="000000" w:themeColor="text1"/>
+          <w:sz w:val="18"/>
+          <w:szCs w:val="18"/>
+        </w:rPr>
         <w:t>, 2025</w:t>
       </w:r>
       <w:r>
@@ -1186,7 +1507,7 @@
           <w:sz w:val="18"/>
           <w:szCs w:val="18"/>
         </w:rPr>
-        <w:t>, pp. 1142-1146.</w:t>
+        <w:t>.</w:t>
       </w:r>
       <w:r>
         <w:rPr>
@@ -1197,12 +1518,11 @@
         </w:rPr>
         <w:t xml:space="preserve"> </w:t>
       </w:r>
-      <w:hyperlink r:id="rId14">
+      <w:hyperlink r:id="rId15">
         <w:r>
           <w:rPr>
             <w:rStyle w:val="Hyperlink"/>
             <w:rFonts w:ascii="Helvetica" w:hAnsi="Helvetica" w:cs="Helvetica"/>
-            <w:color w:val="0070C0"/>
             <w:sz w:val="18"/>
             <w:szCs w:val="18"/>
           </w:rPr>
@@ -1265,7 +1585,47 @@
           <w:sz w:val="18"/>
           <w:szCs w:val="18"/>
         </w:rPr>
-        <w:t xml:space="preserve">Anh Nguyen, Hyeongil Nam, Kangsoo Kim. “Investigating Visual Guide Cues in VR: Impacts of Virtual Humans and Symbol-Based Navigation on Real-World Performance and Experience”. </w:t>
+        <w:t xml:space="preserve">Anh Nguyen, </w:t>
+      </w:r>
+      <w:proofErr w:type="spellStart"/>
+      <w:r>
+        <w:rPr>
+          <w:rFonts w:ascii="Helvetica" w:hAnsi="Helvetica" w:cs="Helvetica"/>
+          <w:color w:val="000000" w:themeColor="text1"/>
+          <w:sz w:val="18"/>
+          <w:szCs w:val="18"/>
+        </w:rPr>
+        <w:t>Hyeongil</w:t>
+      </w:r>
+      <w:proofErr w:type="spellEnd"/>
+      <w:r>
+        <w:rPr>
+          <w:rFonts w:ascii="Helvetica" w:hAnsi="Helvetica" w:cs="Helvetica"/>
+          <w:color w:val="000000" w:themeColor="text1"/>
+          <w:sz w:val="18"/>
+          <w:szCs w:val="18"/>
+        </w:rPr>
+        <w:t xml:space="preserve"> Nam, </w:t>
+      </w:r>
+      <w:proofErr w:type="spellStart"/>
+      <w:r>
+        <w:rPr>
+          <w:rFonts w:ascii="Helvetica" w:hAnsi="Helvetica" w:cs="Helvetica"/>
+          <w:color w:val="000000" w:themeColor="text1"/>
+          <w:sz w:val="18"/>
+          <w:szCs w:val="18"/>
+        </w:rPr>
+        <w:t>Kangsoo</w:t>
+      </w:r>
+      <w:proofErr w:type="spellEnd"/>
+      <w:r>
+        <w:rPr>
+          <w:rFonts w:ascii="Helvetica" w:hAnsi="Helvetica" w:cs="Helvetica"/>
+          <w:color w:val="000000" w:themeColor="text1"/>
+          <w:sz w:val="18"/>
+          <w:szCs w:val="18"/>
+        </w:rPr>
+        <w:t xml:space="preserve"> Kim. “Investigating Visual Guide Cues in VR: Impacts of Virtual Humans and Symbol-Based Navigation on Real-World Performance and Experience”. </w:t>
       </w:r>
       <w:r>
         <w:rPr>
@@ -1296,41 +1656,22 @@
           <w:sz w:val="18"/>
           <w:szCs w:val="18"/>
         </w:rPr>
-        <w:t xml:space="preserve">, </w:t>
-      </w:r>
-      <w:r>
-        <w:rPr>
-          <w:rFonts w:ascii="Helvetica" w:hAnsi="Helvetica" w:cs="Helvetica"/>
-          <w:color w:val="000000" w:themeColor="text1"/>
-          <w:sz w:val="18"/>
-          <w:szCs w:val="18"/>
-        </w:rPr>
-        <w:t>2025</w:t>
-      </w:r>
-      <w:r>
-        <w:rPr>
-          <w:rFonts w:ascii="Helvetica" w:hAnsi="Helvetica" w:cs="Helvetica"/>
-          <w:color w:val="000000" w:themeColor="text1"/>
-          <w:sz w:val="18"/>
-          <w:szCs w:val="18"/>
-        </w:rPr>
-        <w:t>, pp. 504-509.</w:t>
-      </w:r>
-      <w:r>
-        <w:rPr>
-          <w:rFonts w:ascii="Helvetica" w:hAnsi="Helvetica" w:cs="Helvetica"/>
-          <w:color w:val="000000" w:themeColor="text1"/>
-          <w:sz w:val="18"/>
-          <w:szCs w:val="18"/>
-        </w:rPr>
-        <w:t xml:space="preserve"> </w:t>
-      </w:r>
-      <w:hyperlink r:id="rId15">
+        <w:t>, pp. 504-509</w:t>
+      </w:r>
+      <w:r>
+        <w:rPr>
+          <w:rFonts w:ascii="Helvetica" w:hAnsi="Helvetica" w:cs="Helvetica"/>
+          <w:color w:val="000000" w:themeColor="text1"/>
+          <w:sz w:val="18"/>
+          <w:szCs w:val="18"/>
+        </w:rPr>
+        <w:t xml:space="preserve">, 2025. </w:t>
+      </w:r>
+      <w:hyperlink r:id="rId16" w:history="1">
         <w:r>
           <w:rPr>
             <w:rStyle w:val="Hyperlink"/>
             <w:rFonts w:ascii="Helvetica" w:hAnsi="Helvetica" w:cs="Helvetica"/>
-            <w:color w:val="0070C0"/>
             <w:sz w:val="18"/>
             <w:szCs w:val="18"/>
           </w:rPr>
@@ -1393,7 +1734,47 @@
           <w:sz w:val="18"/>
           <w:szCs w:val="18"/>
         </w:rPr>
-        <w:t xml:space="preserve">Zaid Ahmed, Hyeongil Nam, Kangsoo Kim. </w:t>
+        <w:t xml:space="preserve">Zaid Ahmed, </w:t>
+      </w:r>
+      <w:proofErr w:type="spellStart"/>
+      <w:r>
+        <w:rPr>
+          <w:rFonts w:ascii="Helvetica" w:hAnsi="Helvetica" w:cs="Helvetica"/>
+          <w:color w:val="000000" w:themeColor="text1"/>
+          <w:sz w:val="18"/>
+          <w:szCs w:val="18"/>
+        </w:rPr>
+        <w:t>Hyeongil</w:t>
+      </w:r>
+      <w:proofErr w:type="spellEnd"/>
+      <w:r>
+        <w:rPr>
+          <w:rFonts w:ascii="Helvetica" w:hAnsi="Helvetica" w:cs="Helvetica"/>
+          <w:color w:val="000000" w:themeColor="text1"/>
+          <w:sz w:val="18"/>
+          <w:szCs w:val="18"/>
+        </w:rPr>
+        <w:t xml:space="preserve"> Nam, </w:t>
+      </w:r>
+      <w:proofErr w:type="spellStart"/>
+      <w:r>
+        <w:rPr>
+          <w:rFonts w:ascii="Helvetica" w:hAnsi="Helvetica" w:cs="Helvetica"/>
+          <w:color w:val="000000" w:themeColor="text1"/>
+          <w:sz w:val="18"/>
+          <w:szCs w:val="18"/>
+        </w:rPr>
+        <w:t>Kangsoo</w:t>
+      </w:r>
+      <w:proofErr w:type="spellEnd"/>
+      <w:r>
+        <w:rPr>
+          <w:rFonts w:ascii="Helvetica" w:hAnsi="Helvetica" w:cs="Helvetica"/>
+          <w:color w:val="000000" w:themeColor="text1"/>
+          <w:sz w:val="18"/>
+          <w:szCs w:val="18"/>
+        </w:rPr>
+        <w:t xml:space="preserve"> Kim. </w:t>
       </w:r>
       <w:r>
         <w:rPr>
@@ -1469,16 +1850,25 @@
           <w:sz w:val="18"/>
           <w:szCs w:val="18"/>
         </w:rPr>
-        <w:t>, 2025</w:t>
-      </w:r>
-      <w:r>
-        <w:rPr>
-          <w:rFonts w:ascii="Helvetica" w:hAnsi="Helvetica" w:cs="Helvetica"/>
-          <w:color w:val="000000" w:themeColor="text1"/>
-          <w:sz w:val="18"/>
-          <w:szCs w:val="18"/>
-        </w:rPr>
-        <w:t>, pp. 1202-1203.</w:t>
+        <w:t xml:space="preserve">, </w:t>
+      </w:r>
+      <w:r>
+        <w:rPr>
+          <w:rFonts w:ascii="Helvetica" w:hAnsi="Helvetica" w:cs="Helvetica"/>
+          <w:color w:val="000000" w:themeColor="text1"/>
+          <w:sz w:val="18"/>
+          <w:szCs w:val="18"/>
+        </w:rPr>
+        <w:t>pp. 1202-1203</w:t>
+      </w:r>
+      <w:r>
+        <w:rPr>
+          <w:rFonts w:ascii="Helvetica" w:hAnsi="Helvetica" w:cs="Helvetica"/>
+          <w:color w:val="000000" w:themeColor="text1"/>
+          <w:sz w:val="18"/>
+          <w:szCs w:val="18"/>
+        </w:rPr>
+        <w:t>, 2025.</w:t>
       </w:r>
       <w:r>
         <w:rPr>
@@ -1489,12 +1879,11 @@
         </w:rPr>
         <w:t xml:space="preserve"> </w:t>
       </w:r>
-      <w:hyperlink r:id="rId16">
+      <w:hyperlink r:id="rId17">
         <w:r>
           <w:rPr>
             <w:rStyle w:val="Hyperlink"/>
             <w:rFonts w:ascii="Helvetica" w:hAnsi="Helvetica" w:cs="Helvetica"/>
-            <w:color w:val="0070C0"/>
             <w:sz w:val="18"/>
             <w:szCs w:val="18"/>
           </w:rPr>
@@ -1537,7 +1926,27 @@
           <w:sz w:val="18"/>
           <w:szCs w:val="18"/>
         </w:rPr>
-        <w:t xml:space="preserve">, Anh Nguyen, Michael Francis, Kangsoo Kim. </w:t>
+        <w:t xml:space="preserve">, Anh Nguyen, Michael Francis, </w:t>
+      </w:r>
+      <w:proofErr w:type="spellStart"/>
+      <w:r>
+        <w:rPr>
+          <w:rFonts w:ascii="Helvetica" w:hAnsi="Helvetica" w:cs="Helvetica"/>
+          <w:color w:val="000000" w:themeColor="text1"/>
+          <w:sz w:val="18"/>
+          <w:szCs w:val="18"/>
+        </w:rPr>
+        <w:t>Kangsoo</w:t>
+      </w:r>
+      <w:proofErr w:type="spellEnd"/>
+      <w:r>
+        <w:rPr>
+          <w:rFonts w:ascii="Helvetica" w:hAnsi="Helvetica" w:cs="Helvetica"/>
+          <w:color w:val="000000" w:themeColor="text1"/>
+          <w:sz w:val="18"/>
+          <w:szCs w:val="18"/>
+        </w:rPr>
+        <w:t xml:space="preserve"> Kim. </w:t>
       </w:r>
       <w:r>
         <w:rPr>
@@ -1617,7 +2026,7 @@
           <w:szCs w:val="18"/>
           <w:shd w:val="clear" w:color="auto" w:fill="FFFFFF"/>
         </w:rPr>
-        <w:t>, 2024</w:t>
+        <w:t xml:space="preserve">, </w:t>
       </w:r>
       <w:r>
         <w:rPr>
@@ -1627,7 +2036,7 @@
           <w:szCs w:val="18"/>
           <w:shd w:val="clear" w:color="auto" w:fill="FFFFFF"/>
         </w:rPr>
-        <w:t>, pp</w:t>
+        <w:t>pp</w:t>
       </w:r>
       <w:r>
         <w:rPr>
@@ -1647,6 +2056,16 @@
           <w:szCs w:val="18"/>
           <w:shd w:val="clear" w:color="auto" w:fill="FFFFFF"/>
         </w:rPr>
+        <w:t>, 2025</w:t>
+      </w:r>
+      <w:r>
+        <w:rPr>
+          <w:rFonts w:ascii="Helvetica" w:hAnsi="Helvetica" w:cs="Helvetica"/>
+          <w:color w:val="000000" w:themeColor="text1"/>
+          <w:sz w:val="18"/>
+          <w:szCs w:val="18"/>
+          <w:shd w:val="clear" w:color="auto" w:fill="FFFFFF"/>
+        </w:rPr>
         <w:t>.</w:t>
       </w:r>
       <w:r>
@@ -1659,12 +2078,11 @@
         </w:rPr>
         <w:t xml:space="preserve"> </w:t>
       </w:r>
-      <w:hyperlink r:id="rId17">
+      <w:hyperlink r:id="rId18">
         <w:r>
           <w:rPr>
             <w:rStyle w:val="Hyperlink"/>
             <w:rFonts w:ascii="Helvetica" w:hAnsi="Helvetica" w:cs="Helvetica"/>
-            <w:color w:val="0070C0"/>
             <w:sz w:val="18"/>
             <w:szCs w:val="18"/>
           </w:rPr>
@@ -1674,7 +2092,6 @@
           <w:rPr>
             <w:rStyle w:val="Hyperlink"/>
             <w:rFonts w:ascii="Helvetica" w:hAnsi="Helvetica" w:cs="Helvetica"/>
-            <w:color w:val="0070C0"/>
             <w:sz w:val="18"/>
             <w:szCs w:val="18"/>
           </w:rPr>
@@ -1933,7 +2350,25 @@
           <w:sz w:val="18"/>
           <w:szCs w:val="18"/>
         </w:rPr>
-        <w:t xml:space="preserve">, UCalgary Students’ Union </w:t>
+        <w:t xml:space="preserve">, </w:t>
+      </w:r>
+      <w:proofErr w:type="spellStart"/>
+      <w:r>
+        <w:rPr>
+          <w:rFonts w:ascii="Helvetica" w:hAnsi="Helvetica" w:cs="Helvetica"/>
+          <w:sz w:val="18"/>
+          <w:szCs w:val="18"/>
+        </w:rPr>
+        <w:t>UCalgary</w:t>
+      </w:r>
+      <w:proofErr w:type="spellEnd"/>
+      <w:r>
+        <w:rPr>
+          <w:rFonts w:ascii="Helvetica" w:hAnsi="Helvetica" w:cs="Helvetica"/>
+          <w:sz w:val="18"/>
+          <w:szCs w:val="18"/>
+        </w:rPr>
+        <w:t xml:space="preserve"> Students’ Union </w:t>
       </w:r>
       <w:r>
         <w:rPr>
@@ -2255,11 +2690,45 @@
         <w:spacing w:after="0" w:line="360" w:lineRule="auto"/>
         <w:rPr>
           <w:rFonts w:ascii="Helvetica" w:hAnsi="Helvetica" w:cs="Helvetica"/>
+          <w:sz w:val="18"/>
+          <w:szCs w:val="18"/>
+        </w:rPr>
+      </w:pPr>
+      <w:r>
+        <w:rPr>
+          <w:rFonts w:ascii="Helvetica" w:hAnsi="Helvetica" w:cs="Helvetica"/>
+          <w:sz w:val="18"/>
+          <w:szCs w:val="18"/>
+        </w:rPr>
+        <w:t>IEEE ISMAR</w:t>
+      </w:r>
+      <w:r>
+        <w:rPr>
+          <w:rFonts w:ascii="Helvetica" w:hAnsi="Helvetica" w:cs="Helvetica"/>
+          <w:sz w:val="18"/>
+          <w:szCs w:val="18"/>
+        </w:rPr>
+        <w:tab/>
+      </w:r>
+      <w:r>
+        <w:rPr>
+          <w:rFonts w:ascii="Helvetica" w:hAnsi="Helvetica" w:cs="Helvetica"/>
           <w:b/>
           <w:bCs/>
           <w:sz w:val="18"/>
           <w:szCs w:val="18"/>
         </w:rPr>
+        <w:t>2026</w:t>
+      </w:r>
+    </w:p>
+    <w:p>
+      <w:pPr>
+        <w:spacing w:after="0" w:line="360" w:lineRule="auto"/>
+        <w:rPr>
+          <w:rFonts w:ascii="Helvetica" w:hAnsi="Helvetica" w:cs="Helvetica"/>
+          <w:sz w:val="18"/>
+          <w:szCs w:val="18"/>
+        </w:rPr>
       </w:pPr>
       <w:r>
         <w:rPr>
@@ -2287,7 +2756,10 @@
         </w:rPr>
         <w:t>2025</w:t>
       </w:r>
-      <w:r>
+    </w:p>
+    <w:p>
+      <w:pPr>
+        <w:spacing w:after="0" w:line="360" w:lineRule="auto"/>
         <w:rPr>
           <w:rFonts w:ascii="Helvetica" w:hAnsi="Helvetica" w:cs="Helvetica"/>
           <w:b/>
@@ -2295,8 +2767,7 @@
           <w:sz w:val="18"/>
           <w:szCs w:val="18"/>
         </w:rPr>
-        <w:br/>
-      </w:r>
+      </w:pPr>
     </w:p>
     <w:p>
       <w:pPr>
@@ -2335,40 +2806,289 @@
         <w:spacing w:after="0" w:line="360" w:lineRule="auto"/>
         <w:rPr>
           <w:rFonts w:ascii="Helvetica" w:hAnsi="Helvetica" w:cs="Helvetica"/>
-          <w:sz w:val="18"/>
-          <w:szCs w:val="18"/>
-        </w:rPr>
-      </w:pPr>
-      <w:r>
-        <w:rPr>
-          <w:rFonts w:ascii="Helvetica" w:hAnsi="Helvetica" w:cs="Helvetica"/>
-          <w:sz w:val="18"/>
-          <w:szCs w:val="18"/>
-        </w:rPr>
-        <w:t>IEEE ISMAR</w:t>
-      </w:r>
-      <w:r>
-        <w:rPr>
-          <w:rFonts w:ascii="Helvetica" w:hAnsi="Helvetica" w:cs="Helvetica"/>
-          <w:sz w:val="18"/>
-          <w:szCs w:val="18"/>
-        </w:rPr>
-        <w:tab/>
-      </w:r>
-      <w:r>
-        <w:rPr>
-          <w:rFonts w:ascii="Helvetica" w:hAnsi="Helvetica" w:cs="Helvetica"/>
           <w:b/>
           <w:bCs/>
           <w:sz w:val="18"/>
           <w:szCs w:val="18"/>
         </w:rPr>
+      </w:pPr>
+      <w:r>
+        <w:rPr>
+          <w:rFonts w:ascii="Helvetica" w:hAnsi="Helvetica" w:cs="Helvetica"/>
+          <w:sz w:val="18"/>
+          <w:szCs w:val="18"/>
+        </w:rPr>
+        <w:t>IEEE ISMAR</w:t>
+      </w:r>
+      <w:r>
+        <w:rPr>
+          <w:rFonts w:ascii="Helvetica" w:hAnsi="Helvetica" w:cs="Helvetica"/>
+          <w:sz w:val="18"/>
+          <w:szCs w:val="18"/>
+        </w:rPr>
+        <w:tab/>
+      </w:r>
+      <w:r>
+        <w:rPr>
+          <w:rFonts w:ascii="Helvetica" w:hAnsi="Helvetica" w:cs="Helvetica"/>
+          <w:b/>
+          <w:bCs/>
+          <w:sz w:val="18"/>
+          <w:szCs w:val="18"/>
+        </w:rPr>
         <w:t>2025</w:t>
       </w:r>
     </w:p>
+    <w:p>
+      <w:pPr>
+        <w:rPr>
+          <w:rFonts w:ascii="Helvetica" w:hAnsi="Helvetica" w:cs="Helvetica"/>
+          <w:sz w:val="18"/>
+          <w:szCs w:val="18"/>
+        </w:rPr>
+      </w:pPr>
+    </w:p>
+    <w:p>
+      <w:pPr>
+        <w:rPr>
+          <w:rFonts w:ascii="Helvetica" w:hAnsi="Helvetica" w:cs="Helvetica"/>
+          <w:sz w:val="18"/>
+          <w:szCs w:val="18"/>
+        </w:rPr>
+      </w:pPr>
+    </w:p>
+    <w:p>
+      <w:pPr>
+        <w:rPr>
+          <w:rFonts w:ascii="Helvetica" w:hAnsi="Helvetica" w:cs="Helvetica"/>
+          <w:sz w:val="18"/>
+          <w:szCs w:val="18"/>
+        </w:rPr>
+      </w:pPr>
+    </w:p>
+    <w:p>
+      <w:pPr>
+        <w:rPr>
+          <w:rFonts w:ascii="Helvetica" w:hAnsi="Helvetica" w:cs="Helvetica"/>
+          <w:sz w:val="18"/>
+          <w:szCs w:val="18"/>
+        </w:rPr>
+      </w:pPr>
+    </w:p>
+    <w:p>
+      <w:pPr>
+        <w:rPr>
+          <w:rFonts w:ascii="Helvetica" w:hAnsi="Helvetica" w:cs="Helvetica"/>
+          <w:sz w:val="18"/>
+          <w:szCs w:val="18"/>
+        </w:rPr>
+      </w:pPr>
+    </w:p>
+    <w:p>
+      <w:pPr>
+        <w:rPr>
+          <w:rFonts w:ascii="Helvetica" w:hAnsi="Helvetica" w:cs="Helvetica"/>
+          <w:sz w:val="18"/>
+          <w:szCs w:val="18"/>
+        </w:rPr>
+      </w:pPr>
+    </w:p>
+    <w:p>
+      <w:pPr>
+        <w:rPr>
+          <w:rFonts w:ascii="Helvetica" w:hAnsi="Helvetica" w:cs="Helvetica"/>
+          <w:sz w:val="18"/>
+          <w:szCs w:val="18"/>
+        </w:rPr>
+      </w:pPr>
+    </w:p>
+    <w:p>
+      <w:pPr>
+        <w:rPr>
+          <w:rFonts w:ascii="Helvetica" w:hAnsi="Helvetica" w:cs="Helvetica"/>
+          <w:sz w:val="18"/>
+          <w:szCs w:val="18"/>
+        </w:rPr>
+      </w:pPr>
+    </w:p>
+    <w:p>
+      <w:pPr>
+        <w:rPr>
+          <w:rFonts w:ascii="Helvetica" w:hAnsi="Helvetica" w:cs="Helvetica"/>
+          <w:sz w:val="18"/>
+          <w:szCs w:val="18"/>
+        </w:rPr>
+      </w:pPr>
+    </w:p>
+    <w:p>
+      <w:pPr>
+        <w:rPr>
+          <w:rFonts w:ascii="Helvetica" w:hAnsi="Helvetica" w:cs="Helvetica"/>
+          <w:sz w:val="18"/>
+          <w:szCs w:val="18"/>
+        </w:rPr>
+      </w:pPr>
+    </w:p>
+    <w:p>
+      <w:pPr>
+        <w:rPr>
+          <w:rFonts w:ascii="Helvetica" w:hAnsi="Helvetica" w:cs="Helvetica"/>
+          <w:sz w:val="18"/>
+          <w:szCs w:val="18"/>
+        </w:rPr>
+      </w:pPr>
+    </w:p>
+    <w:p>
+      <w:pPr>
+        <w:rPr>
+          <w:rFonts w:ascii="Helvetica" w:hAnsi="Helvetica" w:cs="Helvetica"/>
+          <w:sz w:val="18"/>
+          <w:szCs w:val="18"/>
+        </w:rPr>
+      </w:pPr>
+    </w:p>
+    <w:p>
+      <w:pPr>
+        <w:rPr>
+          <w:rFonts w:ascii="Helvetica" w:hAnsi="Helvetica" w:cs="Helvetica"/>
+          <w:sz w:val="18"/>
+          <w:szCs w:val="18"/>
+        </w:rPr>
+      </w:pPr>
+    </w:p>
+    <w:p>
+      <w:pPr>
+        <w:rPr>
+          <w:rFonts w:ascii="Helvetica" w:hAnsi="Helvetica" w:cs="Helvetica"/>
+          <w:sz w:val="18"/>
+          <w:szCs w:val="18"/>
+        </w:rPr>
+      </w:pPr>
+    </w:p>
+    <w:p>
+      <w:pPr>
+        <w:rPr>
+          <w:rFonts w:ascii="Helvetica" w:hAnsi="Helvetica" w:cs="Helvetica"/>
+          <w:sz w:val="18"/>
+          <w:szCs w:val="18"/>
+        </w:rPr>
+      </w:pPr>
+    </w:p>
+    <w:p>
+      <w:pPr>
+        <w:rPr>
+          <w:rFonts w:ascii="Helvetica" w:hAnsi="Helvetica" w:cs="Helvetica"/>
+          <w:sz w:val="18"/>
+          <w:szCs w:val="18"/>
+        </w:rPr>
+      </w:pPr>
+    </w:p>
+    <w:p>
+      <w:pPr>
+        <w:rPr>
+          <w:rFonts w:ascii="Helvetica" w:hAnsi="Helvetica" w:cs="Helvetica"/>
+          <w:sz w:val="18"/>
+          <w:szCs w:val="18"/>
+        </w:rPr>
+      </w:pPr>
+    </w:p>
+    <w:p>
+      <w:pPr>
+        <w:rPr>
+          <w:rFonts w:ascii="Helvetica" w:hAnsi="Helvetica" w:cs="Helvetica"/>
+          <w:sz w:val="18"/>
+          <w:szCs w:val="18"/>
+        </w:rPr>
+      </w:pPr>
+    </w:p>
+    <w:p>
+      <w:pPr>
+        <w:rPr>
+          <w:rFonts w:ascii="Helvetica" w:hAnsi="Helvetica" w:cs="Helvetica"/>
+          <w:sz w:val="18"/>
+          <w:szCs w:val="18"/>
+        </w:rPr>
+      </w:pPr>
+    </w:p>
+    <w:p>
+      <w:pPr>
+        <w:rPr>
+          <w:rFonts w:ascii="Helvetica" w:hAnsi="Helvetica" w:cs="Helvetica"/>
+          <w:sz w:val="18"/>
+          <w:szCs w:val="18"/>
+        </w:rPr>
+      </w:pPr>
+    </w:p>
+    <w:p>
+      <w:pPr>
+        <w:rPr>
+          <w:rFonts w:ascii="Helvetica" w:hAnsi="Helvetica" w:cs="Helvetica"/>
+          <w:sz w:val="18"/>
+          <w:szCs w:val="18"/>
+        </w:rPr>
+      </w:pPr>
+    </w:p>
+    <w:p>
+      <w:pPr>
+        <w:rPr>
+          <w:rFonts w:ascii="Helvetica" w:hAnsi="Helvetica" w:cs="Helvetica"/>
+          <w:sz w:val="18"/>
+          <w:szCs w:val="18"/>
+        </w:rPr>
+      </w:pPr>
+    </w:p>
+    <w:p>
+      <w:pPr>
+        <w:rPr>
+          <w:rFonts w:ascii="Helvetica" w:hAnsi="Helvetica" w:cs="Helvetica"/>
+          <w:sz w:val="18"/>
+          <w:szCs w:val="18"/>
+        </w:rPr>
+      </w:pPr>
+    </w:p>
+    <w:p>
+      <w:pPr>
+        <w:rPr>
+          <w:rFonts w:ascii="Helvetica" w:hAnsi="Helvetica" w:cs="Helvetica"/>
+          <w:sz w:val="18"/>
+          <w:szCs w:val="18"/>
+        </w:rPr>
+      </w:pPr>
+    </w:p>
+    <w:p>
+      <w:pPr>
+        <w:rPr>
+          <w:rFonts w:ascii="Helvetica" w:hAnsi="Helvetica" w:cs="Helvetica"/>
+          <w:b/>
+          <w:bCs/>
+          <w:sz w:val="18"/>
+          <w:szCs w:val="18"/>
+        </w:rPr>
+      </w:pPr>
+    </w:p>
+    <w:p>
+      <w:pPr>
+        <w:tabs>
+          <w:tab w:val="left" w:pos="7643"/>
+        </w:tabs>
+        <w:rPr>
+          <w:rFonts w:ascii="Helvetica" w:hAnsi="Helvetica" w:cs="Helvetica"/>
+          <w:sz w:val="18"/>
+          <w:szCs w:val="18"/>
+        </w:rPr>
+      </w:pPr>
+      <w:r>
+        <w:rPr>
+          <w:rFonts w:ascii="Helvetica" w:hAnsi="Helvetica" w:cs="Helvetica"/>
+          <w:sz w:val="18"/>
+          <w:szCs w:val="18"/>
+        </w:rPr>
+        <w:tab/>
+      </w:r>
+    </w:p>
     <w:sectPr>
-      <w:footerReference w:type="default" r:id="rId18"/>
-      <w:footerReference w:type="first" r:id="rId19"/>
+      <w:footerReference w:type="default" r:id="rId19"/>
+      <w:footerReference w:type="first" r:id="rId20"/>
       <w:type w:val="continuous"/>
       <w:pgSz w:w="12240" w:h="15840"/>
       <w:pgMar w:top="720" w:right="720" w:bottom="720" w:left="720" w:header="708" w:footer="708" w:gutter="0"/>
@@ -2421,7 +3141,23 @@
         <w:b/>
         <w:bCs/>
       </w:rPr>
-      <w:t>Omar Khan</w:t>
+      <w:t xml:space="preserve">Omar </w:t>
+    </w:r>
+    <w:r>
+      <w:rPr>
+        <w:rFonts w:ascii="Helvetica" w:hAnsi="Helvetica"/>
+        <w:b/>
+        <w:bCs/>
+      </w:rPr>
+      <w:t xml:space="preserve">A. </w:t>
+    </w:r>
+    <w:r>
+      <w:rPr>
+        <w:rFonts w:ascii="Helvetica" w:hAnsi="Helvetica"/>
+        <w:b/>
+        <w:bCs/>
+      </w:rPr>
+      <w:t>Khan</w:t>
     </w:r>
     <w:r>
       <w:rPr>
@@ -2449,7 +3185,23 @@
         <w:b/>
         <w:bCs/>
       </w:rPr>
-      <w:t>Omar Khan</w:t>
+      <w:t xml:space="preserve">Omar </w:t>
+    </w:r>
+    <w:r>
+      <w:rPr>
+        <w:rFonts w:ascii="Helvetica" w:hAnsi="Helvetica" w:cs="Arial"/>
+        <w:b/>
+        <w:bCs/>
+      </w:rPr>
+      <w:t xml:space="preserve">A. </w:t>
+    </w:r>
+    <w:r>
+      <w:rPr>
+        <w:rFonts w:ascii="Helvetica" w:hAnsi="Helvetica" w:cs="Arial"/>
+        <w:b/>
+        <w:bCs/>
+      </w:rPr>
+      <w:t>Khan</w:t>
     </w:r>
     <w:r>
       <w:rPr>
@@ -3436,10 +4188,10 @@
     <w:basedOn w:val="DefaultParagraphFont"/>
     <w:uiPriority w:val="99"/>
     <w:unhideWhenUsed/>
-    <w:rsid w:val="000F462D"/>
+    <w:rsid w:val="00F957CF"/>
     <w:rPr>
       <w:b/>
-      <w:color w:val="006600"/>
+      <w:color w:val="0070C0"/>
       <w:u w:val="single"/>
     </w:rPr>
   </w:style>

</xml_diff>

<commit_message>
cleaning up and update cv
</commit_message>
<xml_diff>
--- a/cv.docx
+++ b/cv.docx
@@ -1482,6 +1482,237 @@
           <w:rFonts w:ascii="Helvetica" w:hAnsi="Helvetica" w:cs="Helvetica"/>
           <w:u w:val="single"/>
         </w:rPr>
+        <w:t>Conference Proceedings</w:t>
+      </w:r>
+    </w:p>
+    <w:p>
+      <w:pPr>
+        <w:pStyle w:val="ListParagraph"/>
+        <w:numPr>
+          <w:ilvl w:val="0"/>
+          <w:numId w:val="7"/>
+        </w:numPr>
+        <w:spacing w:line="276" w:lineRule="auto"/>
+        <w:rPr>
+          <w:rFonts w:ascii="Helvetica" w:hAnsi="Helvetica" w:cs="Helvetica"/>
+          <w:color w:val="000000" w:themeColor="text1"/>
+          <w:sz w:val="18"/>
+          <w:szCs w:val="18"/>
+        </w:rPr>
+      </w:pPr>
+      <w:r>
+        <w:rPr>
+          <w:rFonts w:ascii="Helvetica" w:hAnsi="Helvetica" w:cs="Helvetica"/>
+          <w:b/>
+          <w:bCs/>
+          <w:color w:val="000000" w:themeColor="text1"/>
+          <w:sz w:val="18"/>
+          <w:szCs w:val="18"/>
+        </w:rPr>
+        <w:t xml:space="preserve">Omar </w:t>
+      </w:r>
+      <w:r>
+        <w:rPr>
+          <w:rFonts w:ascii="Helvetica" w:hAnsi="Helvetica" w:cs="Helvetica"/>
+          <w:b/>
+          <w:bCs/>
+          <w:color w:val="000000" w:themeColor="text1"/>
+          <w:sz w:val="18"/>
+          <w:szCs w:val="18"/>
+        </w:rPr>
+        <w:t xml:space="preserve">A. </w:t>
+      </w:r>
+      <w:r>
+        <w:rPr>
+          <w:rFonts w:ascii="Helvetica" w:hAnsi="Helvetica" w:cs="Helvetica"/>
+          <w:b/>
+          <w:bCs/>
+          <w:color w:val="000000" w:themeColor="text1"/>
+          <w:sz w:val="18"/>
+          <w:szCs w:val="18"/>
+        </w:rPr>
+        <w:t>Khan</w:t>
+      </w:r>
+      <w:r>
+        <w:rPr>
+          <w:rFonts w:ascii="Helvetica" w:hAnsi="Helvetica" w:cs="Helvetica"/>
+          <w:color w:val="000000" w:themeColor="text1"/>
+          <w:sz w:val="18"/>
+          <w:szCs w:val="18"/>
+        </w:rPr>
+        <w:t>,</w:t>
+      </w:r>
+      <w:r>
+        <w:rPr>
+          <w:rFonts w:ascii="Helvetica" w:hAnsi="Helvetica" w:cs="Helvetica"/>
+          <w:color w:val="000000" w:themeColor="text1"/>
+          <w:sz w:val="18"/>
+          <w:szCs w:val="18"/>
+        </w:rPr>
+        <w:t xml:space="preserve"> Bao Han Trinh, Lee Lisle, Tiffany D. Do</w:t>
+      </w:r>
+      <w:r>
+        <w:rPr>
+          <w:rFonts w:ascii="Helvetica" w:hAnsi="Helvetica" w:cs="Helvetica"/>
+          <w:color w:val="000000" w:themeColor="text1"/>
+          <w:sz w:val="18"/>
+          <w:szCs w:val="18"/>
+        </w:rPr>
+        <w:t>. “</w:t>
+      </w:r>
+      <w:r>
+        <w:rPr>
+          <w:rFonts w:ascii="Helvetica" w:hAnsi="Helvetica" w:cs="Helvetica"/>
+          <w:color w:val="000000" w:themeColor="text1"/>
+          <w:sz w:val="18"/>
+          <w:szCs w:val="18"/>
+        </w:rPr>
+        <w:t>Influence of Avatar Appearance and Target Distance on</w:t>
+      </w:r>
+      <w:r>
+        <w:rPr>
+          <w:rFonts w:ascii="Helvetica" w:hAnsi="Helvetica" w:cs="Helvetica"/>
+          <w:color w:val="000000" w:themeColor="text1"/>
+          <w:sz w:val="18"/>
+          <w:szCs w:val="18"/>
+        </w:rPr>
+        <w:t xml:space="preserve"> </w:t>
+      </w:r>
+      <w:r>
+        <w:rPr>
+          <w:rFonts w:ascii="Helvetica" w:hAnsi="Helvetica" w:cs="Helvetica"/>
+          <w:color w:val="000000" w:themeColor="text1"/>
+          <w:sz w:val="18"/>
+          <w:szCs w:val="18"/>
+        </w:rPr>
+        <w:t>Locomotion Method Selection in Virtual Reality”</w:t>
+      </w:r>
+      <w:r>
+        <w:rPr>
+          <w:rFonts w:ascii="Helvetica" w:hAnsi="Helvetica" w:cs="Helvetica"/>
+          <w:color w:val="000000" w:themeColor="text1"/>
+          <w:sz w:val="18"/>
+          <w:szCs w:val="18"/>
+        </w:rPr>
+        <w:t xml:space="preserve">. </w:t>
+      </w:r>
+      <w:r>
+        <w:rPr>
+          <w:rFonts w:ascii="Helvetica" w:hAnsi="Helvetica" w:cs="Helvetica"/>
+          <w:color w:val="000000" w:themeColor="text1"/>
+          <w:sz w:val="18"/>
+          <w:szCs w:val="18"/>
+        </w:rPr>
+        <w:t>Accepted to the IEEE International Symposium on Mixed and Augmented Reality (ISMAR), 2026</w:t>
+      </w:r>
+      <w:r>
+        <w:rPr>
+          <w:rFonts w:ascii="Helvetica" w:hAnsi="Helvetica" w:cs="Helvetica"/>
+          <w:color w:val="000000" w:themeColor="text1"/>
+          <w:sz w:val="18"/>
+          <w:szCs w:val="18"/>
+        </w:rPr>
+        <w:t xml:space="preserve">. </w:t>
+      </w:r>
+      <w:hyperlink r:id="rId14" w:history="1">
+        <w:r>
+          <w:rPr>
+            <w:rStyle w:val="Hyperlink"/>
+            <w:rFonts w:ascii="Helvetica" w:hAnsi="Helvetica" w:cs="Helvetica"/>
+            <w:sz w:val="18"/>
+            <w:szCs w:val="18"/>
+          </w:rPr>
+          <w:t>https://doi.org/10.48550/arXiv.2606.26364</w:t>
+        </w:r>
+      </w:hyperlink>
+      <w:r>
+        <w:rPr>
+          <w:rFonts w:ascii="Helvetica" w:hAnsi="Helvetica" w:cs="Helvetica"/>
+          <w:color w:val="000000" w:themeColor="text1"/>
+          <w:sz w:val="18"/>
+          <w:szCs w:val="18"/>
+        </w:rPr>
+        <w:t xml:space="preserve"> </w:t>
+      </w:r>
+      <w:r>
+        <w:rPr>
+          <w:rFonts w:ascii="Helvetica" w:hAnsi="Helvetica" w:cs="Helvetica"/>
+          <w:color w:val="000000" w:themeColor="text1"/>
+          <w:sz w:val="18"/>
+          <w:szCs w:val="18"/>
+        </w:rPr>
+        <w:br/>
+      </w:r>
+      <w:r>
+        <w:rPr>
+          <w:rFonts w:ascii="Helvetica" w:hAnsi="Helvetica" w:cs="Helvetica"/>
+          <w:color w:val="7030A0"/>
+          <w:sz w:val="18"/>
+          <w:szCs w:val="18"/>
+        </w:rPr>
+        <w:t xml:space="preserve">Acceptance rate: </w:t>
+      </w:r>
+      <w:r>
+        <w:rPr>
+          <w:rFonts w:ascii="Helvetica" w:hAnsi="Helvetica" w:cs="Helvetica"/>
+          <w:b/>
+          <w:bCs/>
+          <w:color w:val="7030A0"/>
+          <w:sz w:val="18"/>
+          <w:szCs w:val="18"/>
+        </w:rPr>
+        <w:t>TBA</w:t>
+      </w:r>
+      <w:r>
+        <w:rPr>
+          <w:rFonts w:ascii="Helvetica" w:hAnsi="Helvetica" w:cs="Helvetica"/>
+          <w:color w:val="7030A0"/>
+          <w:sz w:val="18"/>
+          <w:szCs w:val="18"/>
+        </w:rPr>
+        <w:t xml:space="preserve">  •  </w:t>
+      </w:r>
+      <w:r>
+        <w:rPr>
+          <w:rFonts w:ascii="Helvetica" w:hAnsi="Helvetica" w:cs="Helvetica"/>
+          <w:color w:val="7030A0"/>
+          <w:sz w:val="18"/>
+          <w:szCs w:val="18"/>
+        </w:rPr>
+        <w:t xml:space="preserve">ICORE rank: </w:t>
+      </w:r>
+      <w:r>
+        <w:rPr>
+          <w:rFonts w:ascii="Helvetica" w:hAnsi="Helvetica" w:cs="Helvetica"/>
+          <w:b/>
+          <w:bCs/>
+          <w:color w:val="7030A0"/>
+          <w:sz w:val="18"/>
+          <w:szCs w:val="18"/>
+        </w:rPr>
+        <w:t>A*</w:t>
+      </w:r>
+    </w:p>
+    <w:p>
+      <w:pPr>
+        <w:spacing w:before="240" w:line="276" w:lineRule="auto"/>
+        <w:rPr>
+          <w:rFonts w:ascii="Helvetica" w:hAnsi="Helvetica" w:cs="Helvetica"/>
+          <w:u w:val="single"/>
+        </w:rPr>
+      </w:pPr>
+      <w:r>
+        <w:rPr>
+          <w:rFonts w:ascii="Helvetica" w:hAnsi="Helvetica" w:cs="Helvetica"/>
+          <w:u w:val="single"/>
+        </w:rPr>
+        <w:t xml:space="preserve">Peer-Reviewed </w:t>
+      </w:r>
+      <w:r>
+        <w:rPr>
+          <w:rFonts w:ascii="Helvetica" w:hAnsi="Helvetica" w:cs="Helvetica"/>
+          <w:u w:val="single"/>
+        </w:rPr>
         <w:t>Extended Abstracts</w:t>
       </w:r>
       <w:r>
@@ -1649,7 +1880,7 @@
         </w:rPr>
         <w:t xml:space="preserve"> </w:t>
       </w:r>
-      <w:hyperlink r:id="rId14" w:history="1">
+      <w:hyperlink r:id="rId15" w:history="1">
         <w:r>
           <w:rPr>
             <w:rStyle w:val="Hyperlink"/>
@@ -1804,7 +2035,7 @@
         </w:rPr>
         <w:t xml:space="preserve"> </w:t>
       </w:r>
-      <w:hyperlink r:id="rId15">
+      <w:hyperlink r:id="rId16">
         <w:r>
           <w:rPr>
             <w:rStyle w:val="Hyperlink"/>
@@ -1912,7 +2143,7 @@
         </w:rPr>
         <w:t xml:space="preserve">, 2025. </w:t>
       </w:r>
-      <w:hyperlink r:id="rId16" w:history="1">
+      <w:hyperlink r:id="rId17" w:history="1">
         <w:r>
           <w:rPr>
             <w:rStyle w:val="Hyperlink"/>
@@ -1949,6 +2180,7 @@
           <w:sz w:val="18"/>
           <w:szCs w:val="18"/>
         </w:rPr>
+        <w:lastRenderedPageBreak/>
         <w:t>Omar Khan</w:t>
       </w:r>
       <w:r>
@@ -2083,7 +2315,7 @@
         </w:rPr>
         <w:t xml:space="preserve"> </w:t>
       </w:r>
-      <w:hyperlink r:id="rId17">
+      <w:hyperlink r:id="rId18">
         <w:r>
           <w:rPr>
             <w:rStyle w:val="Hyperlink"/>
@@ -2261,7 +2493,7 @@
         </w:rPr>
         <w:t xml:space="preserve"> </w:t>
       </w:r>
-      <w:hyperlink r:id="rId18">
+      <w:hyperlink r:id="rId19">
         <w:r>
           <w:rPr>
             <w:rStyle w:val="Hyperlink"/>
@@ -2281,44 +2513,30 @@
           <w:t>10.1109/VRW62533.2024.00238</w:t>
         </w:r>
       </w:hyperlink>
-    </w:p>
-    <w:p>
-      <w:pPr>
-        <w:tabs>
-          <w:tab w:val="left" w:pos="8784"/>
-        </w:tabs>
+      <w:r>
+        <w:rPr>
+          <w:rFonts w:ascii="Helvetica" w:hAnsi="Helvetica" w:cs="Helvetica"/>
+          <w:b/>
+          <w:bCs/>
+        </w:rPr>
+        <w:tab/>
+      </w:r>
+    </w:p>
+    <w:p>
+      <w:pPr>
         <w:spacing w:before="240" w:line="360" w:lineRule="auto"/>
         <w:rPr>
           <w:rFonts w:ascii="Helvetica" w:hAnsi="Helvetica" w:cs="Helvetica"/>
-          <w:b/>
-          <w:bCs/>
-        </w:rPr>
-      </w:pPr>
-      <w:r>
-        <w:rPr>
-          <w:rFonts w:ascii="Helvetica" w:hAnsi="Helvetica" w:cs="Helvetica"/>
-          <w:b/>
-          <w:bCs/>
-        </w:rPr>
-        <w:tab/>
-      </w:r>
-    </w:p>
-    <w:p>
-      <w:pPr>
-        <w:spacing w:before="240" w:line="360" w:lineRule="auto"/>
-        <w:rPr>
-          <w:rFonts w:ascii="Helvetica" w:hAnsi="Helvetica" w:cs="Helvetica"/>
-          <w:sz w:val="18"/>
-          <w:szCs w:val="18"/>
-        </w:rPr>
-      </w:pPr>
-      <w:r>
-        <w:rPr>
-          <w:rFonts w:ascii="Helvetica" w:hAnsi="Helvetica" w:cs="Helvetica"/>
-          <w:b/>
-          <w:bCs/>
-        </w:rPr>
-        <w:lastRenderedPageBreak/>
+          <w:sz w:val="18"/>
+          <w:szCs w:val="18"/>
+        </w:rPr>
+      </w:pPr>
+      <w:r>
+        <w:rPr>
+          <w:rFonts w:ascii="Helvetica" w:hAnsi="Helvetica" w:cs="Helvetica"/>
+          <w:b/>
+          <w:bCs/>
+        </w:rPr>
         <w:t>Awards</w:t>
       </w:r>
       <w:r>
@@ -3295,42 +3513,6 @@
     </w:p>
     <w:p>
       <w:pPr>
-        <w:rPr>
-          <w:rFonts w:ascii="Helvetica" w:hAnsi="Helvetica" w:cs="Helvetica"/>
-          <w:sz w:val="18"/>
-          <w:szCs w:val="18"/>
-        </w:rPr>
-      </w:pPr>
-    </w:p>
-    <w:p>
-      <w:pPr>
-        <w:rPr>
-          <w:rFonts w:ascii="Helvetica" w:hAnsi="Helvetica" w:cs="Helvetica"/>
-          <w:sz w:val="18"/>
-          <w:szCs w:val="18"/>
-        </w:rPr>
-      </w:pPr>
-    </w:p>
-    <w:p>
-      <w:pPr>
-        <w:rPr>
-          <w:rFonts w:ascii="Helvetica" w:hAnsi="Helvetica" w:cs="Helvetica"/>
-          <w:sz w:val="18"/>
-          <w:szCs w:val="18"/>
-        </w:rPr>
-      </w:pPr>
-    </w:p>
-    <w:p>
-      <w:pPr>
-        <w:rPr>
-          <w:rFonts w:ascii="Helvetica" w:hAnsi="Helvetica" w:cs="Helvetica"/>
-          <w:sz w:val="18"/>
-          <w:szCs w:val="18"/>
-        </w:rPr>
-      </w:pPr>
-    </w:p>
-    <w:p>
-      <w:pPr>
         <w:tabs>
           <w:tab w:val="left" w:pos="9084"/>
         </w:tabs>
@@ -3350,9 +3532,9 @@
       </w:r>
     </w:p>
     <w:sectPr>
-      <w:footerReference w:type="default" r:id="rId19"/>
-      <w:headerReference w:type="first" r:id="rId20"/>
-      <w:footerReference w:type="first" r:id="rId21"/>
+      <w:footerReference w:type="default" r:id="rId20"/>
+      <w:headerReference w:type="first" r:id="rId21"/>
+      <w:footerReference w:type="first" r:id="rId22"/>
       <w:type w:val="continuous"/>
       <w:pgSz w:w="12240" w:h="15840"/>
       <w:pgMar w:top="720" w:right="720" w:bottom="720" w:left="720" w:header="708" w:footer="708" w:gutter="0"/>
@@ -3997,13 +4179,13 @@
     </w:lvl>
   </w:abstractNum>
   <w:abstractNum w:abstractNumId="4" w15:restartNumberingAfterBreak="0">
-    <w:nsid w:val="64991120"/>
+    <w:nsid w:val="49D65B7F"/>
     <w:multiLevelType w:val="hybridMultilevel"/>
-    <w:tmpl w:val="9F76E872"/>
-    <w:lvl w:ilvl="0" w:tplc="6A548BB8">
+    <w:tmpl w:val="2286FA74"/>
+    <w:lvl w:ilvl="0" w:tplc="25709D62">
       <w:start w:val="1"/>
       <w:numFmt w:val="decimal"/>
-      <w:lvlText w:val="J%1."/>
+      <w:lvlText w:val="C%1."/>
       <w:lvlJc w:val="left"/>
       <w:pPr>
         <w:ind w:left="720" w:hanging="493"/>
@@ -4014,7 +4196,7 @@
         <w:bCs/>
       </w:rPr>
     </w:lvl>
-    <w:lvl w:ilvl="1" w:tplc="10090019" w:tentative="1">
+    <w:lvl w:ilvl="1" w:tplc="FFFFFFFF" w:tentative="1">
       <w:start w:val="1"/>
       <w:numFmt w:val="lowerLetter"/>
       <w:lvlText w:val="%2."/>
@@ -4023,7 +4205,7 @@
         <w:ind w:left="1440" w:hanging="360"/>
       </w:pPr>
     </w:lvl>
-    <w:lvl w:ilvl="2" w:tplc="1009001B" w:tentative="1">
+    <w:lvl w:ilvl="2" w:tplc="FFFFFFFF" w:tentative="1">
       <w:start w:val="1"/>
       <w:numFmt w:val="lowerRoman"/>
       <w:lvlText w:val="%3."/>
@@ -4032,7 +4214,7 @@
         <w:ind w:left="2160" w:hanging="180"/>
       </w:pPr>
     </w:lvl>
-    <w:lvl w:ilvl="3" w:tplc="1009000F" w:tentative="1">
+    <w:lvl w:ilvl="3" w:tplc="FFFFFFFF" w:tentative="1">
       <w:start w:val="1"/>
       <w:numFmt w:val="decimal"/>
       <w:lvlText w:val="%4."/>
@@ -4041,7 +4223,7 @@
         <w:ind w:left="2880" w:hanging="360"/>
       </w:pPr>
     </w:lvl>
-    <w:lvl w:ilvl="4" w:tplc="10090019" w:tentative="1">
+    <w:lvl w:ilvl="4" w:tplc="FFFFFFFF" w:tentative="1">
       <w:start w:val="1"/>
       <w:numFmt w:val="lowerLetter"/>
       <w:lvlText w:val="%5."/>
@@ -4050,7 +4232,7 @@
         <w:ind w:left="3600" w:hanging="360"/>
       </w:pPr>
     </w:lvl>
-    <w:lvl w:ilvl="5" w:tplc="1009001B" w:tentative="1">
+    <w:lvl w:ilvl="5" w:tplc="FFFFFFFF" w:tentative="1">
       <w:start w:val="1"/>
       <w:numFmt w:val="lowerRoman"/>
       <w:lvlText w:val="%6."/>
@@ -4059,7 +4241,7 @@
         <w:ind w:left="4320" w:hanging="180"/>
       </w:pPr>
     </w:lvl>
-    <w:lvl w:ilvl="6" w:tplc="1009000F" w:tentative="1">
+    <w:lvl w:ilvl="6" w:tplc="FFFFFFFF" w:tentative="1">
       <w:start w:val="1"/>
       <w:numFmt w:val="decimal"/>
       <w:lvlText w:val="%7."/>
@@ -4068,7 +4250,7 @@
         <w:ind w:left="5040" w:hanging="360"/>
       </w:pPr>
     </w:lvl>
-    <w:lvl w:ilvl="7" w:tplc="10090019" w:tentative="1">
+    <w:lvl w:ilvl="7" w:tplc="FFFFFFFF" w:tentative="1">
       <w:start w:val="1"/>
       <w:numFmt w:val="lowerLetter"/>
       <w:lvlText w:val="%8."/>
@@ -4077,7 +4259,7 @@
         <w:ind w:left="5760" w:hanging="360"/>
       </w:pPr>
     </w:lvl>
-    <w:lvl w:ilvl="8" w:tplc="1009001B" w:tentative="1">
+    <w:lvl w:ilvl="8" w:tplc="FFFFFFFF" w:tentative="1">
       <w:start w:val="1"/>
       <w:numFmt w:val="lowerRoman"/>
       <w:lvlText w:val="%9."/>
@@ -4088,6 +4270,97 @@
     </w:lvl>
   </w:abstractNum>
   <w:abstractNum w:abstractNumId="5" w15:restartNumberingAfterBreak="0">
+    <w:nsid w:val="64991120"/>
+    <w:multiLevelType w:val="hybridMultilevel"/>
+    <w:tmpl w:val="9F76E872"/>
+    <w:lvl w:ilvl="0" w:tplc="6A548BB8">
+      <w:start w:val="1"/>
+      <w:numFmt w:val="decimal"/>
+      <w:lvlText w:val="J%1."/>
+      <w:lvlJc w:val="left"/>
+      <w:pPr>
+        <w:ind w:left="720" w:hanging="493"/>
+      </w:pPr>
+      <w:rPr>
+        <w:rFonts w:hint="default"/>
+        <w:b/>
+        <w:bCs/>
+      </w:rPr>
+    </w:lvl>
+    <w:lvl w:ilvl="1" w:tplc="10090019" w:tentative="1">
+      <w:start w:val="1"/>
+      <w:numFmt w:val="lowerLetter"/>
+      <w:lvlText w:val="%2."/>
+      <w:lvlJc w:val="left"/>
+      <w:pPr>
+        <w:ind w:left="1440" w:hanging="360"/>
+      </w:pPr>
+    </w:lvl>
+    <w:lvl w:ilvl="2" w:tplc="1009001B" w:tentative="1">
+      <w:start w:val="1"/>
+      <w:numFmt w:val="lowerRoman"/>
+      <w:lvlText w:val="%3."/>
+      <w:lvlJc w:val="right"/>
+      <w:pPr>
+        <w:ind w:left="2160" w:hanging="180"/>
+      </w:pPr>
+    </w:lvl>
+    <w:lvl w:ilvl="3" w:tplc="1009000F" w:tentative="1">
+      <w:start w:val="1"/>
+      <w:numFmt w:val="decimal"/>
+      <w:lvlText w:val="%4."/>
+      <w:lvlJc w:val="left"/>
+      <w:pPr>
+        <w:ind w:left="2880" w:hanging="360"/>
+      </w:pPr>
+    </w:lvl>
+    <w:lvl w:ilvl="4" w:tplc="10090019" w:tentative="1">
+      <w:start w:val="1"/>
+      <w:numFmt w:val="lowerLetter"/>
+      <w:lvlText w:val="%5."/>
+      <w:lvlJc w:val="left"/>
+      <w:pPr>
+        <w:ind w:left="3600" w:hanging="360"/>
+      </w:pPr>
+    </w:lvl>
+    <w:lvl w:ilvl="5" w:tplc="1009001B" w:tentative="1">
+      <w:start w:val="1"/>
+      <w:numFmt w:val="lowerRoman"/>
+      <w:lvlText w:val="%6."/>
+      <w:lvlJc w:val="right"/>
+      <w:pPr>
+        <w:ind w:left="4320" w:hanging="180"/>
+      </w:pPr>
+    </w:lvl>
+    <w:lvl w:ilvl="6" w:tplc="1009000F" w:tentative="1">
+      <w:start w:val="1"/>
+      <w:numFmt w:val="decimal"/>
+      <w:lvlText w:val="%7."/>
+      <w:lvlJc w:val="left"/>
+      <w:pPr>
+        <w:ind w:left="5040" w:hanging="360"/>
+      </w:pPr>
+    </w:lvl>
+    <w:lvl w:ilvl="7" w:tplc="10090019" w:tentative="1">
+      <w:start w:val="1"/>
+      <w:numFmt w:val="lowerLetter"/>
+      <w:lvlText w:val="%8."/>
+      <w:lvlJc w:val="left"/>
+      <w:pPr>
+        <w:ind w:left="5760" w:hanging="360"/>
+      </w:pPr>
+    </w:lvl>
+    <w:lvl w:ilvl="8" w:tplc="1009001B" w:tentative="1">
+      <w:start w:val="1"/>
+      <w:numFmt w:val="lowerRoman"/>
+      <w:lvlText w:val="%9."/>
+      <w:lvlJc w:val="right"/>
+      <w:pPr>
+        <w:ind w:left="6480" w:hanging="180"/>
+      </w:pPr>
+    </w:lvl>
+  </w:abstractNum>
+  <w:abstractNum w:abstractNumId="6" w15:restartNumberingAfterBreak="0">
     <w:nsid w:val="774C6FCB"/>
     <w:multiLevelType w:val="hybridMultilevel"/>
     <w:tmpl w:val="32C8841E"/>
@@ -4180,16 +4453,19 @@
     <w:abstractNumId w:val="2"/>
   </w:num>
   <w:num w:numId="3" w16cid:durableId="5444625">
-    <w:abstractNumId w:val="5"/>
+    <w:abstractNumId w:val="6"/>
   </w:num>
   <w:num w:numId="4" w16cid:durableId="1811703777">
-    <w:abstractNumId w:val="4"/>
+    <w:abstractNumId w:val="5"/>
   </w:num>
   <w:num w:numId="5" w16cid:durableId="33847657">
     <w:abstractNumId w:val="0"/>
   </w:num>
   <w:num w:numId="6" w16cid:durableId="619845302">
     <w:abstractNumId w:val="1"/>
+  </w:num>
+  <w:num w:numId="7" w16cid:durableId="1355955109">
+    <w:abstractNumId w:val="4"/>
   </w:num>
 </w:numbering>
 </file>
@@ -4599,7 +4875,6 @@
   <w:style w:type="character" w:default="1" w:styleId="DefaultParagraphFont">
     <w:name w:val="Default Paragraph Font"/>
     <w:uiPriority w:val="1"/>
-    <w:semiHidden/>
     <w:unhideWhenUsed/>
   </w:style>
   <w:style w:type="table" w:default="1" w:styleId="TableNormal">

</xml_diff>